<commit_message>
Roteiro Roberto Müller: revisão da parte 4
Co-Authored-By: Claude Opus 5.5 <noreply@anthropic.com>
Claude-Session: https://claude.ai/code/session_01MJjUEEZrxQDEUifKK2vj9g
</commit_message>
<xml_diff>
--- a/roteiros/roberto-muller/RobertoMuller_Parte4.docx
+++ b/roteiros/roberto-muller/RobertoMuller_Parte4.docx
@@ -31,7 +31,7 @@
         <w:rPr>
           <w:color w:val="000000"/>
         </w:rPr>
-        <w:t>O apelo publicado em Luzilândia circulou em portais do interior e em grupos de mensagens. Bem longe dos programas de domingo que um dia tinham recebido o Pingo de Ouro.</w:t>
+        <w:t>O apelo publicado em Luzilândia circulou em portais do interior e nas redes sociais. Bem longe dos programas de domingo que um dia tinham recebido o Pingo de Ouro.</w:t>
       </w:r>
     </w:p>
     <w:p>
@@ -173,6 +173,46 @@
     <w:p>
       <w:r>
         <w:rPr>
+          <w:color w:val="000000"/>
+        </w:rPr>
+        <w:t>Existe uma ironia amarga nos títulos das músicas que ele gravou.</w:t>
+      </w:r>
+    </w:p>
+    <w:p>
+      <w:r>
+        <w:rPr>
+          <w:color w:val="000000"/>
+        </w:rPr>
+        <w:t>Em mil novecentos e setenta e sete, Roberto Müller gravou uma canção chamada "Vida de Cão Sem Dono". Na época, era só mais uma música de dor de cotovelo, de homem largado pela mulher amada.</w:t>
+      </w:r>
+    </w:p>
+    <w:p>
+      <w:r>
+        <w:rPr>
+          <w:color w:val="000000"/>
+        </w:rPr>
+        <w:t>Quase cinquenta anos depois, o título parece falar de outra coisa. De um artista que o país deixou para trás. De um ídolo que perdeu o lugar nas rádios e na lembrança do público.</w:t>
+      </w:r>
+    </w:p>
+    <w:p>
+      <w:r>
+        <w:rPr>
+          <w:color w:val="000000"/>
+        </w:rPr>
+        <w:t>E houve outra, gravada ainda nos anos sessenta, que virou o maior sucesso da vida dele. "Nunca Mais Brigarei Contigo". Uma promessa de amor.</w:t>
+      </w:r>
+    </w:p>
+    <w:p>
+      <w:r>
+        <w:rPr>
+          <w:color w:val="000000"/>
+        </w:rPr>
+        <w:t>O Brasil cumpriu essa promessa do jeito mais cruel possível. Simplesmente parou de falar dele.</w:t>
+      </w:r>
+    </w:p>
+    <w:p>
+      <w:r>
+        <w:rPr>
           <w:color w:val="C00000"/>
         </w:rPr>
         <w:t>Guarde esses dois títulos. Porque a resposta verdadeira para a pergunta "o que aconteceu com Roberto Müller" só foi dada pela família depois que ele morreu. E ela é muito mais dura do que qualquer um desses vídeos mostrou.</w:t>
@@ -255,7 +295,7 @@
         <w:rPr>
           <w:color w:val="000000"/>
         </w:rPr>
-        <w:t>Para quem nunca conviveu com a doença, é difícil entender o tamanho dela. O Alzheimer não chega de uma vez. Ele vai apagando a memória aos poucos, começando pelas coisas mais recentes. Um nome que some. Um rosto que não se reconhece. Uma pergunta repetida três vezes na mesma tarde.</w:t>
+        <w:t>Para quem nunca conviveu com a doença, é difícil entender o tamanho dela. O Alzheimer não chega de uma vez. Ele vai apagando a memória aos poucos, começando pelas coisas mais recentes. Um nome que some, uma pergunta repetida três vezes na mesma tarde.</w:t>
       </w:r>
     </w:p>
     <w:p>
@@ -272,46 +312,6 @@
           <w:color w:val="000000"/>
         </w:rPr>
         <w:t>Para um homem como Roberto Müller, isso tem um peso ainda maior.</w:t>
-      </w:r>
-    </w:p>
-    <w:p>
-      <w:r>
-        <w:rPr>
-          <w:color w:val="000000"/>
-        </w:rPr>
-        <w:t>Existe uma ironia amarga nos títulos das músicas que ele gravou.</w:t>
-      </w:r>
-    </w:p>
-    <w:p>
-      <w:r>
-        <w:rPr>
-          <w:color w:val="000000"/>
-        </w:rPr>
-        <w:t>Em mil novecentos e setenta e sete, Roberto Müller gravou uma canção chamada "Vida de Cão Sem Dono". Na época, era só mais uma música de dor de cotovelo, de homem largado pela mulher amada.</w:t>
-      </w:r>
-    </w:p>
-    <w:p>
-      <w:r>
-        <w:rPr>
-          <w:color w:val="000000"/>
-        </w:rPr>
-        <w:t>Quase cinquenta anos depois, o título parece falar de outra coisa. De um artista que o país deixou para trás. De um ídolo que perdeu o lugar nos palcos, nas rádios e na lembrança do público.</w:t>
-      </w:r>
-    </w:p>
-    <w:p>
-      <w:r>
-        <w:rPr>
-          <w:color w:val="000000"/>
-        </w:rPr>
-        <w:t>E houve outra, gravada ainda nos anos sessenta, que virou o maior sucesso da vida dele. "Nunca Mais Brigarei Contigo". Uma promessa de amor.</w:t>
-      </w:r>
-    </w:p>
-    <w:p>
-      <w:r>
-        <w:rPr>
-          <w:color w:val="000000"/>
-        </w:rPr>
-        <w:t>O Brasil cumpriu essa promessa do jeito mais cruel possível. Simplesmente parou de falar dele.</w:t>
       </w:r>
     </w:p>
     <w:p>
@@ -471,7 +471,7 @@
         <w:rPr>
           <w:color w:val="000000"/>
         </w:rPr>
-        <w:t>Os fãs lembravam. Mas, dentro daquele quarto no Recife, o homem que eles homenageavam já estava muito longe daquelas lembranças.</w:t>
+        <w:t>Os fãs lembravam. Mas, dentro daquele quarto no Recife, pelo que se soube depois, o homem que eles homenageavam já não podia acompanhar aquelas homenagens.</w:t>
       </w:r>
     </w:p>
     <w:p>
@@ -519,7 +519,7 @@
         <w:rPr>
           <w:color w:val="1F4EB4"/>
         </w:rPr>
-        <w:t>Lembra do vídeo de dezembro de dois mil e vinte e um? Aquele em que Roberto aparece deitado, cantando, e que os fãs encheram de mensagens de carinho?</w:t>
+        <w:t>Lembra do vídeo de dezembro de dois mil e vinte e um, aquele em que Roberto aparece deitado, cantando, e que os fãs encheram de mensagens de carinho?</w:t>
       </w:r>
     </w:p>
     <w:p>
@@ -527,7 +527,7 @@
         <w:rPr>
           <w:color w:val="1F4EB4"/>
         </w:rPr>
-        <w:t>Pelas contas da família, quando aquele vídeo foi gravado, ele já estava preso à cama havia mais de um ano. Aquela cama era a vida dele. E aquela música, cantada deitado, foi uma das últimas vezes em que o Brasil ouviu a voz do Pingo de Ouro.</w:t>
+        <w:t>Fazendo as contas a partir do que a família contou, quando aquele vídeo foi gravado, ele já estava preso à cama havia mais de um ano. Aquela cama era a vida dele. E aquela música, cantada deitado, foi uma das últimas vezes em que o Brasil ouviu a voz do Pingo de Ouro.</w:t>
       </w:r>
     </w:p>
     <w:p>

</xml_diff>